<commit_message>
Add word-by-word recording script, zip bundles, and tighter notebook skeleton
Co-Authored-By: Claude Sonnet 5.5 <noreply@anthropic.com>
Claude-Session: https://claude.ai/code/session_01MRVCd4DNWuPbgPzkwafrkL
</commit_message>
<xml_diff>
--- a/task_pump_selection/inputs/memo_template.docx
+++ b/task_pump_selection/inputs/memo_template.docx
@@ -42,6 +42,7 @@
         <w:t>1. Purpose</w:t>
       </w:r>
     </w:p>
+    <w:p/>
     <w:p>
       <w:pPr>
         <w:pStyle w:val="Heading2"/>
@@ -50,6 +51,7 @@
         <w:t>2. Duty point and criteria</w:t>
       </w:r>
     </w:p>
+    <w:p/>
     <w:p>
       <w:pPr>
         <w:pStyle w:val="Heading2"/>
@@ -58,6 +60,7 @@
         <w:t>3. Results</w:t>
       </w:r>
     </w:p>
+    <w:p/>
     <w:p>
       <w:pPr>
         <w:pStyle w:val="Heading2"/>
@@ -66,6 +69,7 @@
         <w:t>4. Operating-point chart</w:t>
       </w:r>
     </w:p>
+    <w:p/>
     <w:p>
       <w:pPr>
         <w:pStyle w:val="Heading2"/>
@@ -74,6 +78,7 @@
         <w:t>5. Recommendation and next step</w:t>
       </w:r>
     </w:p>
+    <w:p/>
     <w:sectPr>
       <w:pgSz w:w="12240" w:h="15840"/>
       <w:pgMar w:top="1152" w:right="1440" w:bottom="1152" w:left="1440" w:header="720" w:footer="720" w:gutter="0"/>

</xml_diff>